<commit_message>
Fixes and clean-up for final
Final report

Few fixes

Changed exit jump from above to above-equal
</commit_message>
<xml_diff>
--- a/TeamRaport.docx
+++ b/TeamRaport.docx
@@ -577,12 +577,12 @@
           <wp:inline distB="114300" distT="114300" distL="114300" distR="114300">
             <wp:extent cx="3008594" cy="575903"/>
             <wp:effectExtent b="0" l="0" r="0" t="0"/>
-            <wp:docPr id="9" name="image14.png"/>
+            <wp:docPr id="4" name="image15.png"/>
             <a:graphic>
               <a:graphicData uri="http://schemas.openxmlformats.org/drawingml/2006/picture">
                 <pic:pic>
                   <pic:nvPicPr>
-                    <pic:cNvPr id="0" name="image14.png"/>
+                    <pic:cNvPr id="0" name="image15.png"/>
                     <pic:cNvPicPr preferRelativeResize="0"/>
                   </pic:nvPicPr>
                   <pic:blipFill>
@@ -630,12 +630,12 @@
           <wp:inline distB="114300" distT="114300" distL="114300" distR="114300">
             <wp:extent cx="2614613" cy="380937"/>
             <wp:effectExtent b="0" l="0" r="0" t="0"/>
-            <wp:docPr id="11" name="image7.png"/>
+            <wp:docPr id="6" name="image1.png"/>
             <a:graphic>
               <a:graphicData uri="http://schemas.openxmlformats.org/drawingml/2006/picture">
                 <pic:pic>
                   <pic:nvPicPr>
-                    <pic:cNvPr id="0" name="image7.png"/>
+                    <pic:cNvPr id="0" name="image1.png"/>
                     <pic:cNvPicPr preferRelativeResize="0"/>
                   </pic:nvPicPr>
                   <pic:blipFill>
@@ -683,12 +683,12 @@
           <wp:inline distB="114300" distT="114300" distL="114300" distR="114300">
             <wp:extent cx="2443163" cy="512424"/>
             <wp:effectExtent b="0" l="0" r="0" t="0"/>
-            <wp:docPr id="15" name="image9.png"/>
+            <wp:docPr id="5" name="image16.png"/>
             <a:graphic>
               <a:graphicData uri="http://schemas.openxmlformats.org/drawingml/2006/picture">
                 <pic:pic>
                   <pic:nvPicPr>
-                    <pic:cNvPr id="0" name="image9.png"/>
+                    <pic:cNvPr id="0" name="image16.png"/>
                     <pic:cNvPicPr preferRelativeResize="0"/>
                   </pic:nvPicPr>
                   <pic:blipFill>
@@ -758,12 +758,12 @@
           <wp:inline distB="114300" distT="114300" distL="114300" distR="114300">
             <wp:extent cx="1957388" cy="529646"/>
             <wp:effectExtent b="0" l="0" r="0" t="0"/>
-            <wp:docPr id="12" name="image5.png"/>
+            <wp:docPr id="8" name="image3.png"/>
             <a:graphic>
               <a:graphicData uri="http://schemas.openxmlformats.org/drawingml/2006/picture">
                 <pic:pic>
                   <pic:nvPicPr>
-                    <pic:cNvPr id="0" name="image5.png"/>
+                    <pic:cNvPr id="0" name="image3.png"/>
                     <pic:cNvPicPr preferRelativeResize="0"/>
                   </pic:nvPicPr>
                   <pic:blipFill>
@@ -811,12 +811,12 @@
           <wp:inline distB="114300" distT="114300" distL="114300" distR="114300">
             <wp:extent cx="1966913" cy="503380"/>
             <wp:effectExtent b="0" l="0" r="0" t="0"/>
-            <wp:docPr id="2" name="image13.png"/>
+            <wp:docPr id="7" name="image12.png"/>
             <a:graphic>
               <a:graphicData uri="http://schemas.openxmlformats.org/drawingml/2006/picture">
                 <pic:pic>
                   <pic:nvPicPr>
-                    <pic:cNvPr id="0" name="image13.png"/>
+                    <pic:cNvPr id="0" name="image12.png"/>
                     <pic:cNvPicPr preferRelativeResize="0"/>
                   </pic:nvPicPr>
                   <pic:blipFill>
@@ -864,12 +864,12 @@
           <wp:inline distB="114300" distT="114300" distL="114300" distR="114300">
             <wp:extent cx="1966913" cy="482308"/>
             <wp:effectExtent b="0" l="0" r="0" t="0"/>
-            <wp:docPr id="8" name="image1.png"/>
+            <wp:docPr id="10" name="image10.png"/>
             <a:graphic>
               <a:graphicData uri="http://schemas.openxmlformats.org/drawingml/2006/picture">
                 <pic:pic>
                   <pic:nvPicPr>
-                    <pic:cNvPr id="0" name="image1.png"/>
+                    <pic:cNvPr id="0" name="image10.png"/>
                     <pic:cNvPicPr preferRelativeResize="0"/>
                   </pic:nvPicPr>
                   <pic:blipFill>
@@ -917,12 +917,12 @@
           <wp:inline distB="114300" distT="114300" distL="114300" distR="114300">
             <wp:extent cx="1966913" cy="482308"/>
             <wp:effectExtent b="0" l="0" r="0" t="0"/>
-            <wp:docPr id="13" name="image10.png"/>
+            <wp:docPr id="9" name="image6.png"/>
             <a:graphic>
               <a:graphicData uri="http://schemas.openxmlformats.org/drawingml/2006/picture">
                 <pic:pic>
                   <pic:nvPicPr>
-                    <pic:cNvPr id="0" name="image10.png"/>
+                    <pic:cNvPr id="0" name="image6.png"/>
                     <pic:cNvPicPr preferRelativeResize="0"/>
                   </pic:nvPicPr>
                   <pic:blipFill>
@@ -980,6 +980,98 @@
       </w:pPr>
       <w:r>
         <w:rPr>
+          <w:rFonts w:ascii="Times New Roman" w:cs="Times New Roman" w:eastAsia="Times New Roman" w:hAnsi="Times New Roman"/>
+          <w:sz w:val="26"/>
+          <w:szCs w:val="26"/>
+        </w:rPr>
+        <w:drawing>
+          <wp:inline distB="114300" distT="114300" distL="114300" distR="114300">
+            <wp:extent cx="1447800" cy="571500"/>
+            <wp:effectExtent b="0" l="0" r="0" t="0"/>
+            <wp:docPr id="12" name="image9.png"/>
+            <a:graphic>
+              <a:graphicData uri="http://schemas.openxmlformats.org/drawingml/2006/picture">
+                <pic:pic>
+                  <pic:nvPicPr>
+                    <pic:cNvPr id="0" name="image9.png"/>
+                    <pic:cNvPicPr preferRelativeResize="0"/>
+                  </pic:nvPicPr>
+                  <pic:blipFill>
+                    <a:blip r:embed="rId13"/>
+                    <a:srcRect b="0" l="0" r="0" t="0"/>
+                    <a:stretch>
+                      <a:fillRect/>
+                    </a:stretch>
+                  </pic:blipFill>
+                  <pic:spPr>
+                    <a:xfrm>
+                      <a:off x="0" y="0"/>
+                      <a:ext cx="1447800" cy="571500"/>
+                    </a:xfrm>
+                    <a:prstGeom prst="rect"/>
+                    <a:ln/>
+                  </pic:spPr>
+                </pic:pic>
+              </a:graphicData>
+            </a:graphic>
+          </wp:inline>
+        </w:drawing>
+      </w:r>
+      <w:r>
+        <w:rPr>
+          <w:rtl w:val="0"/>
+        </w:rPr>
+      </w:r>
+    </w:p>
+    <w:p>
+      <w:pPr>
+        <w:rPr>
+          <w:rFonts w:ascii="Times New Roman" w:cs="Times New Roman" w:eastAsia="Times New Roman" w:hAnsi="Times New Roman"/>
+          <w:sz w:val="26"/>
+          <w:szCs w:val="26"/>
+        </w:rPr>
+      </w:pPr>
+      <w:r>
+        <w:rPr>
+          <w:rFonts w:ascii="Times New Roman" w:cs="Times New Roman" w:eastAsia="Times New Roman" w:hAnsi="Times New Roman"/>
+          <w:sz w:val="26"/>
+          <w:szCs w:val="26"/>
+        </w:rPr>
+        <w:drawing>
+          <wp:inline distB="114300" distT="114300" distL="114300" distR="114300">
+            <wp:extent cx="1466850" cy="571500"/>
+            <wp:effectExtent b="0" l="0" r="0" t="0"/>
+            <wp:docPr id="11" name="image13.png"/>
+            <a:graphic>
+              <a:graphicData uri="http://schemas.openxmlformats.org/drawingml/2006/picture">
+                <pic:pic>
+                  <pic:nvPicPr>
+                    <pic:cNvPr id="0" name="image13.png"/>
+                    <pic:cNvPicPr preferRelativeResize="0"/>
+                  </pic:nvPicPr>
+                  <pic:blipFill>
+                    <a:blip r:embed="rId14"/>
+                    <a:srcRect b="0" l="0" r="0" t="0"/>
+                    <a:stretch>
+                      <a:fillRect/>
+                    </a:stretch>
+                  </pic:blipFill>
+                  <pic:spPr>
+                    <a:xfrm>
+                      <a:off x="0" y="0"/>
+                      <a:ext cx="1466850" cy="571500"/>
+                    </a:xfrm>
+                    <a:prstGeom prst="rect"/>
+                    <a:ln/>
+                  </pic:spPr>
+                </pic:pic>
+              </a:graphicData>
+            </a:graphic>
+          </wp:inline>
+        </w:drawing>
+      </w:r>
+      <w:r>
+        <w:rPr>
           <w:rtl w:val="0"/>
         </w:rPr>
       </w:r>
@@ -1024,16 +1116,16 @@
           <wp:inline distB="114300" distT="114300" distL="114300" distR="114300">
             <wp:extent cx="1785938" cy="517663"/>
             <wp:effectExtent b="0" l="0" r="0" t="0"/>
-            <wp:docPr id="6" name="image12.png"/>
+            <wp:docPr id="15" name="image2.png"/>
             <a:graphic>
               <a:graphicData uri="http://schemas.openxmlformats.org/drawingml/2006/picture">
                 <pic:pic>
                   <pic:nvPicPr>
-                    <pic:cNvPr id="0" name="image12.png"/>
+                    <pic:cNvPr id="0" name="image2.png"/>
                     <pic:cNvPicPr preferRelativeResize="0"/>
                   </pic:nvPicPr>
                   <pic:blipFill>
-                    <a:blip r:embed="rId13"/>
+                    <a:blip r:embed="rId15"/>
                     <a:srcRect b="0" l="0" r="0" t="0"/>
                     <a:stretch>
                       <a:fillRect/>
@@ -1077,16 +1169,16 @@
           <wp:inline distB="114300" distT="114300" distL="114300" distR="114300">
             <wp:extent cx="3405188" cy="500500"/>
             <wp:effectExtent b="0" l="0" r="0" t="0"/>
-            <wp:docPr id="14" name="image4.png"/>
+            <wp:docPr id="13" name="image19.png"/>
             <a:graphic>
               <a:graphicData uri="http://schemas.openxmlformats.org/drawingml/2006/picture">
                 <pic:pic>
                   <pic:nvPicPr>
-                    <pic:cNvPr id="0" name="image4.png"/>
+                    <pic:cNvPr id="0" name="image19.png"/>
                     <pic:cNvPicPr preferRelativeResize="0"/>
                   </pic:nvPicPr>
                   <pic:blipFill>
-                    <a:blip r:embed="rId14"/>
+                    <a:blip r:embed="rId16"/>
                     <a:srcRect b="0" l="0" r="0" t="0"/>
                     <a:stretch>
                       <a:fillRect/>
@@ -1158,62 +1250,6 @@
       <w:pPr>
         <w:rPr>
           <w:rFonts w:ascii="Times New Roman" w:cs="Times New Roman" w:eastAsia="Times New Roman" w:hAnsi="Times New Roman"/>
-          <w:sz w:val="26"/>
-          <w:szCs w:val="26"/>
-        </w:rPr>
-      </w:pPr>
-      <w:r>
-        <w:rPr>
-          <w:rtl w:val="0"/>
-        </w:rPr>
-      </w:r>
-    </w:p>
-    <w:p>
-      <w:pPr>
-        <w:rPr>
-          <w:rFonts w:ascii="Times New Roman" w:cs="Times New Roman" w:eastAsia="Times New Roman" w:hAnsi="Times New Roman"/>
-          <w:sz w:val="26"/>
-          <w:szCs w:val="26"/>
-        </w:rPr>
-      </w:pPr>
-      <w:r>
-        <w:rPr>
-          <w:rtl w:val="0"/>
-        </w:rPr>
-      </w:r>
-    </w:p>
-    <w:p>
-      <w:pPr>
-        <w:rPr>
-          <w:rFonts w:ascii="Times New Roman" w:cs="Times New Roman" w:eastAsia="Times New Roman" w:hAnsi="Times New Roman"/>
-          <w:sz w:val="26"/>
-          <w:szCs w:val="26"/>
-        </w:rPr>
-      </w:pPr>
-      <w:r>
-        <w:rPr>
-          <w:rtl w:val="0"/>
-        </w:rPr>
-      </w:r>
-    </w:p>
-    <w:p>
-      <w:pPr>
-        <w:rPr>
-          <w:rFonts w:ascii="Times New Roman" w:cs="Times New Roman" w:eastAsia="Times New Roman" w:hAnsi="Times New Roman"/>
-          <w:sz w:val="26"/>
-          <w:szCs w:val="26"/>
-        </w:rPr>
-      </w:pPr>
-      <w:r>
-        <w:rPr>
-          <w:rtl w:val="0"/>
-        </w:rPr>
-      </w:r>
-    </w:p>
-    <w:p>
-      <w:pPr>
-        <w:rPr>
-          <w:rFonts w:ascii="Times New Roman" w:cs="Times New Roman" w:eastAsia="Times New Roman" w:hAnsi="Times New Roman"/>
           <w:b w:val="1"/>
           <w:bCs w:val="1"/>
           <w:sz w:val="32"/>
@@ -1307,16 +1343,16 @@
           <wp:inline distB="0" distT="0" distL="0" distR="0">
             <wp:extent cx="5629564" cy="3229141"/>
             <wp:effectExtent b="0" l="0" r="0" t="0"/>
-            <wp:docPr id="10" name="image2.png"/>
+            <wp:docPr id="14" name="image20.png"/>
             <a:graphic>
               <a:graphicData uri="http://schemas.openxmlformats.org/drawingml/2006/picture">
                 <pic:pic>
                   <pic:nvPicPr>
-                    <pic:cNvPr id="0" name="image2.png"/>
+                    <pic:cNvPr id="0" name="image20.png"/>
                     <pic:cNvPicPr preferRelativeResize="0"/>
                   </pic:nvPicPr>
                   <pic:blipFill>
-                    <a:blip r:embed="rId15"/>
+                    <a:blip r:embed="rId17"/>
                     <a:srcRect b="0" l="0" r="0" t="0"/>
                     <a:stretch>
                       <a:fillRect/>
@@ -1361,16 +1397,16 @@
           <wp:inline distB="0" distT="0" distL="0" distR="0">
             <wp:extent cx="5658141" cy="4276945"/>
             <wp:effectExtent b="0" l="0" r="0" t="0"/>
-            <wp:docPr id="7" name="image8.png"/>
+            <wp:docPr id="16" name="image23.png"/>
             <a:graphic>
               <a:graphicData uri="http://schemas.openxmlformats.org/drawingml/2006/picture">
                 <pic:pic>
                   <pic:nvPicPr>
-                    <pic:cNvPr id="0" name="image8.png"/>
+                    <pic:cNvPr id="0" name="image23.png"/>
                     <pic:cNvPicPr preferRelativeResize="0"/>
                   </pic:nvPicPr>
                   <pic:blipFill>
-                    <a:blip r:embed="rId16"/>
+                    <a:blip r:embed="rId18"/>
                     <a:srcRect b="0" l="0" r="0" t="0"/>
                     <a:stretch>
                       <a:fillRect/>
@@ -1648,6 +1684,7 @@
     </w:p>
     <w:p>
       <w:pPr>
+        <w:spacing w:after="160" w:line="278.00000000000006" w:lineRule="auto"/>
         <w:rPr>
           <w:rFonts w:ascii="Times New Roman" w:cs="Times New Roman" w:eastAsia="Times New Roman" w:hAnsi="Times New Roman"/>
           <w:b w:val="1"/>
@@ -1665,535 +1702,354 @@
           <w:szCs w:val="32"/>
           <w:rtl w:val="0"/>
         </w:rPr>
-        <w:t xml:space="preserve">Exercise 2:</w:t>
-      </w:r>
-    </w:p>
-    <w:p>
-      <w:pPr>
-        <w:rPr>
-          <w:rFonts w:ascii="Times New Roman" w:cs="Times New Roman" w:eastAsia="Times New Roman" w:hAnsi="Times New Roman"/>
-          <w:sz w:val="26"/>
-          <w:szCs w:val="26"/>
-        </w:rPr>
-      </w:pPr>
-      <w:r>
-        <w:rPr>
-          <w:rtl w:val="0"/>
-        </w:rPr>
-      </w:r>
-    </w:p>
-    <w:p>
-      <w:pPr>
-        <w:rPr>
-          <w:rFonts w:ascii="Times New Roman" w:cs="Times New Roman" w:eastAsia="Times New Roman" w:hAnsi="Times New Roman"/>
-          <w:sz w:val="26"/>
-          <w:szCs w:val="26"/>
-        </w:rPr>
-      </w:pPr>
-      <w:r>
-        <w:rPr>
-          <w:rtl w:val="0"/>
-        </w:rPr>
-      </w:r>
-    </w:p>
-    <w:p>
-      <w:pPr>
-        <w:rPr>
-          <w:rFonts w:ascii="Times New Roman" w:cs="Times New Roman" w:eastAsia="Times New Roman" w:hAnsi="Times New Roman"/>
-          <w:sz w:val="26"/>
-          <w:szCs w:val="26"/>
-        </w:rPr>
-      </w:pPr>
-      <w:r>
-        <w:rPr>
-          <w:rtl w:val="0"/>
-        </w:rPr>
-      </w:r>
-    </w:p>
-    <w:p>
-      <w:pPr>
-        <w:rPr>
-          <w:rFonts w:ascii="Times New Roman" w:cs="Times New Roman" w:eastAsia="Times New Roman" w:hAnsi="Times New Roman"/>
-          <w:sz w:val="26"/>
-          <w:szCs w:val="26"/>
-        </w:rPr>
-      </w:pPr>
-      <w:r>
-        <w:rPr>
-          <w:rtl w:val="0"/>
-        </w:rPr>
-      </w:r>
-    </w:p>
-    <w:p>
-      <w:pPr>
-        <w:rPr>
-          <w:rFonts w:ascii="Times New Roman" w:cs="Times New Roman" w:eastAsia="Times New Roman" w:hAnsi="Times New Roman"/>
-          <w:sz w:val="26"/>
-          <w:szCs w:val="26"/>
-        </w:rPr>
-      </w:pPr>
-      <w:r>
-        <w:rPr>
-          <w:rtl w:val="0"/>
-        </w:rPr>
-      </w:r>
-    </w:p>
-    <w:p>
-      <w:pPr>
-        <w:rPr>
-          <w:rFonts w:ascii="Times New Roman" w:cs="Times New Roman" w:eastAsia="Times New Roman" w:hAnsi="Times New Roman"/>
-          <w:sz w:val="26"/>
-          <w:szCs w:val="26"/>
-        </w:rPr>
-      </w:pPr>
-      <w:r>
-        <w:rPr>
-          <w:rtl w:val="0"/>
-        </w:rPr>
-      </w:r>
-    </w:p>
-    <w:p>
-      <w:pPr>
-        <w:rPr>
-          <w:rFonts w:ascii="Times New Roman" w:cs="Times New Roman" w:eastAsia="Times New Roman" w:hAnsi="Times New Roman"/>
-          <w:sz w:val="26"/>
-          <w:szCs w:val="26"/>
-        </w:rPr>
-      </w:pPr>
-      <w:r>
-        <w:rPr>
-          <w:rtl w:val="0"/>
-        </w:rPr>
-      </w:r>
-    </w:p>
-    <w:p>
-      <w:pPr>
-        <w:rPr>
-          <w:rFonts w:ascii="Times New Roman" w:cs="Times New Roman" w:eastAsia="Times New Roman" w:hAnsi="Times New Roman"/>
-          <w:sz w:val="26"/>
-          <w:szCs w:val="26"/>
-        </w:rPr>
-      </w:pPr>
-      <w:r>
-        <w:rPr>
-          <w:rtl w:val="0"/>
-        </w:rPr>
-      </w:r>
-    </w:p>
-    <w:p>
-      <w:pPr>
-        <w:rPr>
-          <w:rFonts w:ascii="Times New Roman" w:cs="Times New Roman" w:eastAsia="Times New Roman" w:hAnsi="Times New Roman"/>
-          <w:sz w:val="26"/>
-          <w:szCs w:val="26"/>
-        </w:rPr>
-      </w:pPr>
-      <w:r>
-        <w:rPr>
-          <w:rtl w:val="0"/>
-        </w:rPr>
-      </w:r>
-    </w:p>
-    <w:p>
-      <w:pPr>
-        <w:rPr>
-          <w:rFonts w:ascii="Times New Roman" w:cs="Times New Roman" w:eastAsia="Times New Roman" w:hAnsi="Times New Roman"/>
-          <w:sz w:val="26"/>
-          <w:szCs w:val="26"/>
-        </w:rPr>
-      </w:pPr>
-      <w:r>
-        <w:rPr>
-          <w:rtl w:val="0"/>
-        </w:rPr>
-      </w:r>
-    </w:p>
-    <w:p>
-      <w:pPr>
-        <w:rPr>
-          <w:rFonts w:ascii="Times New Roman" w:cs="Times New Roman" w:eastAsia="Times New Roman" w:hAnsi="Times New Roman"/>
-          <w:sz w:val="26"/>
-          <w:szCs w:val="26"/>
-        </w:rPr>
-      </w:pPr>
-      <w:r>
-        <w:rPr>
-          <w:rtl w:val="0"/>
-        </w:rPr>
-      </w:r>
-    </w:p>
-    <w:p>
-      <w:pPr>
-        <w:rPr>
-          <w:rFonts w:ascii="Times New Roman" w:cs="Times New Roman" w:eastAsia="Times New Roman" w:hAnsi="Times New Roman"/>
-          <w:sz w:val="26"/>
-          <w:szCs w:val="26"/>
-        </w:rPr>
-      </w:pPr>
-      <w:r>
-        <w:rPr>
-          <w:rtl w:val="0"/>
-        </w:rPr>
-      </w:r>
-    </w:p>
-    <w:p>
-      <w:pPr>
-        <w:rPr>
-          <w:rFonts w:ascii="Times New Roman" w:cs="Times New Roman" w:eastAsia="Times New Roman" w:hAnsi="Times New Roman"/>
-          <w:sz w:val="26"/>
-          <w:szCs w:val="26"/>
-        </w:rPr>
-      </w:pPr>
-      <w:r>
-        <w:rPr>
-          <w:rtl w:val="0"/>
-        </w:rPr>
-      </w:r>
-    </w:p>
-    <w:p>
-      <w:pPr>
-        <w:rPr>
-          <w:rFonts w:ascii="Times New Roman" w:cs="Times New Roman" w:eastAsia="Times New Roman" w:hAnsi="Times New Roman"/>
-          <w:sz w:val="26"/>
-          <w:szCs w:val="26"/>
-        </w:rPr>
-      </w:pPr>
-      <w:r>
-        <w:rPr>
-          <w:rtl w:val="0"/>
-        </w:rPr>
-      </w:r>
-    </w:p>
-    <w:p>
-      <w:pPr>
-        <w:rPr>
-          <w:rFonts w:ascii="Times New Roman" w:cs="Times New Roman" w:eastAsia="Times New Roman" w:hAnsi="Times New Roman"/>
-          <w:sz w:val="26"/>
-          <w:szCs w:val="26"/>
-        </w:rPr>
-      </w:pPr>
-      <w:r>
-        <w:rPr>
-          <w:rtl w:val="0"/>
-        </w:rPr>
-      </w:r>
-    </w:p>
-    <w:p>
-      <w:pPr>
-        <w:rPr>
-          <w:rFonts w:ascii="Times New Roman" w:cs="Times New Roman" w:eastAsia="Times New Roman" w:hAnsi="Times New Roman"/>
-          <w:sz w:val="26"/>
-          <w:szCs w:val="26"/>
-        </w:rPr>
-      </w:pPr>
-      <w:r>
-        <w:rPr>
-          <w:rtl w:val="0"/>
-        </w:rPr>
-      </w:r>
-    </w:p>
-    <w:p>
-      <w:pPr>
-        <w:rPr>
-          <w:rFonts w:ascii="Times New Roman" w:cs="Times New Roman" w:eastAsia="Times New Roman" w:hAnsi="Times New Roman"/>
-          <w:sz w:val="26"/>
-          <w:szCs w:val="26"/>
-        </w:rPr>
-      </w:pPr>
-      <w:r>
-        <w:rPr>
-          <w:rtl w:val="0"/>
-        </w:rPr>
-      </w:r>
-    </w:p>
-    <w:p>
-      <w:pPr>
-        <w:rPr>
-          <w:rFonts w:ascii="Times New Roman" w:cs="Times New Roman" w:eastAsia="Times New Roman" w:hAnsi="Times New Roman"/>
-          <w:sz w:val="26"/>
-          <w:szCs w:val="26"/>
-        </w:rPr>
-      </w:pPr>
-      <w:r>
-        <w:rPr>
-          <w:rtl w:val="0"/>
-        </w:rPr>
-      </w:r>
-    </w:p>
-    <w:p>
-      <w:pPr>
-        <w:rPr>
-          <w:rFonts w:ascii="Times New Roman" w:cs="Times New Roman" w:eastAsia="Times New Roman" w:hAnsi="Times New Roman"/>
-          <w:sz w:val="26"/>
-          <w:szCs w:val="26"/>
-        </w:rPr>
-      </w:pPr>
-      <w:r>
-        <w:rPr>
-          <w:rtl w:val="0"/>
-        </w:rPr>
-      </w:r>
-    </w:p>
-    <w:p>
-      <w:pPr>
-        <w:rPr>
-          <w:rFonts w:ascii="Times New Roman" w:cs="Times New Roman" w:eastAsia="Times New Roman" w:hAnsi="Times New Roman"/>
-          <w:sz w:val="26"/>
-          <w:szCs w:val="26"/>
-        </w:rPr>
-      </w:pPr>
-      <w:r>
-        <w:rPr>
-          <w:rtl w:val="0"/>
-        </w:rPr>
-      </w:r>
-    </w:p>
-    <w:p>
-      <w:pPr>
-        <w:rPr>
-          <w:rFonts w:ascii="Times New Roman" w:cs="Times New Roman" w:eastAsia="Times New Roman" w:hAnsi="Times New Roman"/>
-          <w:sz w:val="26"/>
-          <w:szCs w:val="26"/>
-        </w:rPr>
-      </w:pPr>
-      <w:r>
-        <w:rPr>
-          <w:rtl w:val="0"/>
-        </w:rPr>
-      </w:r>
-    </w:p>
-    <w:p>
-      <w:pPr>
-        <w:rPr>
-          <w:rFonts w:ascii="Times New Roman" w:cs="Times New Roman" w:eastAsia="Times New Roman" w:hAnsi="Times New Roman"/>
-          <w:sz w:val="26"/>
-          <w:szCs w:val="26"/>
-        </w:rPr>
-      </w:pPr>
-      <w:r>
-        <w:rPr>
-          <w:rtl w:val="0"/>
-        </w:rPr>
-      </w:r>
-    </w:p>
-    <w:p>
-      <w:pPr>
-        <w:rPr>
-          <w:rFonts w:ascii="Times New Roman" w:cs="Times New Roman" w:eastAsia="Times New Roman" w:hAnsi="Times New Roman"/>
-          <w:sz w:val="26"/>
-          <w:szCs w:val="26"/>
-        </w:rPr>
-      </w:pPr>
-      <w:r>
-        <w:rPr>
-          <w:rtl w:val="0"/>
-        </w:rPr>
-      </w:r>
-    </w:p>
-    <w:p>
-      <w:pPr>
-        <w:rPr>
-          <w:rFonts w:ascii="Times New Roman" w:cs="Times New Roman" w:eastAsia="Times New Roman" w:hAnsi="Times New Roman"/>
-          <w:sz w:val="26"/>
-          <w:szCs w:val="26"/>
-        </w:rPr>
-      </w:pPr>
-      <w:r>
-        <w:rPr>
-          <w:rtl w:val="0"/>
-        </w:rPr>
-      </w:r>
-    </w:p>
-    <w:p>
-      <w:pPr>
-        <w:rPr>
-          <w:rFonts w:ascii="Times New Roman" w:cs="Times New Roman" w:eastAsia="Times New Roman" w:hAnsi="Times New Roman"/>
-          <w:sz w:val="26"/>
-          <w:szCs w:val="26"/>
-        </w:rPr>
-      </w:pPr>
-      <w:r>
-        <w:rPr>
-          <w:rtl w:val="0"/>
-        </w:rPr>
-      </w:r>
-    </w:p>
-    <w:p>
-      <w:pPr>
-        <w:rPr>
-          <w:rFonts w:ascii="Times New Roman" w:cs="Times New Roman" w:eastAsia="Times New Roman" w:hAnsi="Times New Roman"/>
-          <w:sz w:val="26"/>
-          <w:szCs w:val="26"/>
-        </w:rPr>
-      </w:pPr>
-      <w:r>
-        <w:rPr>
-          <w:rtl w:val="0"/>
-        </w:rPr>
-      </w:r>
-    </w:p>
-    <w:p>
-      <w:pPr>
-        <w:rPr>
-          <w:rFonts w:ascii="Times New Roman" w:cs="Times New Roman" w:eastAsia="Times New Roman" w:hAnsi="Times New Roman"/>
-          <w:sz w:val="26"/>
-          <w:szCs w:val="26"/>
-        </w:rPr>
-      </w:pPr>
-      <w:r>
-        <w:rPr>
-          <w:rtl w:val="0"/>
-        </w:rPr>
-      </w:r>
-    </w:p>
-    <w:p>
-      <w:pPr>
-        <w:rPr>
-          <w:rFonts w:ascii="Times New Roman" w:cs="Times New Roman" w:eastAsia="Times New Roman" w:hAnsi="Times New Roman"/>
-          <w:sz w:val="26"/>
-          <w:szCs w:val="26"/>
-        </w:rPr>
-      </w:pPr>
-      <w:r>
-        <w:rPr>
-          <w:rtl w:val="0"/>
-        </w:rPr>
-      </w:r>
-    </w:p>
-    <w:p>
-      <w:pPr>
-        <w:rPr>
-          <w:rFonts w:ascii="Times New Roman" w:cs="Times New Roman" w:eastAsia="Times New Roman" w:hAnsi="Times New Roman"/>
-          <w:sz w:val="26"/>
-          <w:szCs w:val="26"/>
-        </w:rPr>
-      </w:pPr>
-      <w:r>
-        <w:rPr>
-          <w:rtl w:val="0"/>
-        </w:rPr>
-      </w:r>
-    </w:p>
-    <w:p>
-      <w:pPr>
-        <w:rPr>
-          <w:rFonts w:ascii="Times New Roman" w:cs="Times New Roman" w:eastAsia="Times New Roman" w:hAnsi="Times New Roman"/>
-          <w:sz w:val="26"/>
-          <w:szCs w:val="26"/>
-        </w:rPr>
-      </w:pPr>
-      <w:r>
-        <w:rPr>
-          <w:rtl w:val="0"/>
-        </w:rPr>
-      </w:r>
-    </w:p>
-    <w:p>
-      <w:pPr>
-        <w:rPr>
-          <w:rFonts w:ascii="Times New Roman" w:cs="Times New Roman" w:eastAsia="Times New Roman" w:hAnsi="Times New Roman"/>
-          <w:sz w:val="26"/>
-          <w:szCs w:val="26"/>
-        </w:rPr>
-      </w:pPr>
-      <w:r>
-        <w:rPr>
-          <w:rtl w:val="0"/>
-        </w:rPr>
-      </w:r>
-    </w:p>
-    <w:p>
-      <w:pPr>
-        <w:rPr>
-          <w:rFonts w:ascii="Times New Roman" w:cs="Times New Roman" w:eastAsia="Times New Roman" w:hAnsi="Times New Roman"/>
-          <w:sz w:val="26"/>
-          <w:szCs w:val="26"/>
-        </w:rPr>
-      </w:pPr>
-      <w:r>
-        <w:rPr>
-          <w:rtl w:val="0"/>
-        </w:rPr>
-      </w:r>
-    </w:p>
-    <w:p>
-      <w:pPr>
-        <w:rPr>
-          <w:rFonts w:ascii="Times New Roman" w:cs="Times New Roman" w:eastAsia="Times New Roman" w:hAnsi="Times New Roman"/>
-          <w:sz w:val="26"/>
-          <w:szCs w:val="26"/>
-        </w:rPr>
-      </w:pPr>
-      <w:r>
-        <w:rPr>
-          <w:rtl w:val="0"/>
-        </w:rPr>
-      </w:r>
-    </w:p>
-    <w:p>
-      <w:pPr>
-        <w:rPr>
-          <w:rFonts w:ascii="Times New Roman" w:cs="Times New Roman" w:eastAsia="Times New Roman" w:hAnsi="Times New Roman"/>
-          <w:sz w:val="26"/>
-          <w:szCs w:val="26"/>
-        </w:rPr>
-      </w:pPr>
-      <w:r>
-        <w:rPr>
-          <w:rtl w:val="0"/>
-        </w:rPr>
-      </w:r>
-    </w:p>
-    <w:p>
-      <w:pPr>
-        <w:rPr>
-          <w:rFonts w:ascii="Times New Roman" w:cs="Times New Roman" w:eastAsia="Times New Roman" w:hAnsi="Times New Roman"/>
-          <w:sz w:val="26"/>
-          <w:szCs w:val="26"/>
-        </w:rPr>
-      </w:pPr>
-      <w:r>
-        <w:rPr>
-          <w:rtl w:val="0"/>
-        </w:rPr>
-      </w:r>
-    </w:p>
-    <w:p>
-      <w:pPr>
-        <w:rPr>
-          <w:rFonts w:ascii="Times New Roman" w:cs="Times New Roman" w:eastAsia="Times New Roman" w:hAnsi="Times New Roman"/>
-          <w:sz w:val="26"/>
-          <w:szCs w:val="26"/>
-        </w:rPr>
-      </w:pPr>
-      <w:r>
-        <w:rPr>
-          <w:rtl w:val="0"/>
-        </w:rPr>
-      </w:r>
-    </w:p>
-    <w:p>
-      <w:pPr>
-        <w:rPr>
-          <w:rFonts w:ascii="Times New Roman" w:cs="Times New Roman" w:eastAsia="Times New Roman" w:hAnsi="Times New Roman"/>
-          <w:sz w:val="26"/>
-          <w:szCs w:val="26"/>
-        </w:rPr>
-      </w:pPr>
-      <w:r>
-        <w:rPr>
-          <w:rtl w:val="0"/>
-        </w:rPr>
-      </w:r>
-    </w:p>
-    <w:p>
-      <w:pPr>
-        <w:rPr>
-          <w:rFonts w:ascii="Times New Roman" w:cs="Times New Roman" w:eastAsia="Times New Roman" w:hAnsi="Times New Roman"/>
-          <w:sz w:val="26"/>
-          <w:szCs w:val="26"/>
-        </w:rPr>
-      </w:pPr>
+        <w:t xml:space="preserve">Exercise 2</w:t>
+      </w:r>
+    </w:p>
+    <w:p>
+      <w:pPr>
+        <w:spacing w:after="160" w:line="278.00000000000006" w:lineRule="auto"/>
+        <w:rPr>
+          <w:rFonts w:ascii="Times New Roman" w:cs="Times New Roman" w:eastAsia="Times New Roman" w:hAnsi="Times New Roman"/>
+          <w:sz w:val="26"/>
+          <w:szCs w:val="26"/>
+        </w:rPr>
+      </w:pPr>
+      <w:r>
+        <w:rPr>
+          <w:rFonts w:ascii="Times New Roman" w:cs="Times New Roman" w:eastAsia="Times New Roman" w:hAnsi="Times New Roman"/>
+          <w:sz w:val="26"/>
+          <w:szCs w:val="26"/>
+          <w:rtl w:val="0"/>
+        </w:rPr>
+        <w:t xml:space="preserve">The values of ESP and EBP registers before calling IsValidAssembly():</w:t>
+      </w:r>
+    </w:p>
+    <w:p>
+      <w:pPr>
+        <w:spacing w:after="160" w:line="278.00000000000006" w:lineRule="auto"/>
+        <w:rPr>
+          <w:rFonts w:ascii="Times New Roman" w:cs="Times New Roman" w:eastAsia="Times New Roman" w:hAnsi="Times New Roman"/>
+          <w:sz w:val="26"/>
+          <w:szCs w:val="26"/>
+        </w:rPr>
+      </w:pPr>
+      <w:r>
+        <w:rPr>
+          <w:rFonts w:ascii="Times New Roman" w:cs="Times New Roman" w:eastAsia="Times New Roman" w:hAnsi="Times New Roman"/>
+          <w:sz w:val="26"/>
+          <w:szCs w:val="26"/>
+        </w:rPr>
+        <w:drawing>
+          <wp:inline distB="0" distT="0" distL="0" distR="0">
+            <wp:extent cx="5738813" cy="1476491"/>
+            <wp:effectExtent b="0" l="0" r="0" t="0"/>
+            <wp:docPr id="17" name="image8.png"/>
+            <a:graphic>
+              <a:graphicData uri="http://schemas.openxmlformats.org/drawingml/2006/picture">
+                <pic:pic>
+                  <pic:nvPicPr>
+                    <pic:cNvPr id="0" name="image8.png"/>
+                    <pic:cNvPicPr preferRelativeResize="0"/>
+                  </pic:nvPicPr>
+                  <pic:blipFill>
+                    <a:blip r:embed="rId19"/>
+                    <a:srcRect b="0" l="0" r="0" t="0"/>
+                    <a:stretch>
+                      <a:fillRect/>
+                    </a:stretch>
+                  </pic:blipFill>
+                  <pic:spPr>
+                    <a:xfrm>
+                      <a:off x="0" y="0"/>
+                      <a:ext cx="5738813" cy="1476491"/>
+                    </a:xfrm>
+                    <a:prstGeom prst="rect"/>
+                    <a:ln/>
+                  </pic:spPr>
+                </pic:pic>
+              </a:graphicData>
+            </a:graphic>
+          </wp:inline>
+        </w:drawing>
+      </w:r>
+      <w:r>
+        <w:rPr>
+          <w:rFonts w:ascii="Times New Roman" w:cs="Times New Roman" w:eastAsia="Times New Roman" w:hAnsi="Times New Roman"/>
+          <w:sz w:val="26"/>
+          <w:szCs w:val="26"/>
+        </w:rPr>
+        <w:drawing>
+          <wp:inline distB="0" distT="0" distL="0" distR="0">
+            <wp:extent cx="5738813" cy="473591"/>
+            <wp:effectExtent b="0" l="0" r="0" t="0"/>
+            <wp:docPr id="18" name="image14.png"/>
+            <a:graphic>
+              <a:graphicData uri="http://schemas.openxmlformats.org/drawingml/2006/picture">
+                <pic:pic>
+                  <pic:nvPicPr>
+                    <pic:cNvPr id="0" name="image14.png"/>
+                    <pic:cNvPicPr preferRelativeResize="0"/>
+                  </pic:nvPicPr>
+                  <pic:blipFill>
+                    <a:blip r:embed="rId20"/>
+                    <a:srcRect b="0" l="0" r="0" t="0"/>
+                    <a:stretch>
+                      <a:fillRect/>
+                    </a:stretch>
+                  </pic:blipFill>
+                  <pic:spPr>
+                    <a:xfrm>
+                      <a:off x="0" y="0"/>
+                      <a:ext cx="5738813" cy="473591"/>
+                    </a:xfrm>
+                    <a:prstGeom prst="rect"/>
+                    <a:ln/>
+                  </pic:spPr>
+                </pic:pic>
+              </a:graphicData>
+            </a:graphic>
+          </wp:inline>
+        </w:drawing>
+      </w:r>
+      <w:r>
+        <w:rPr>
+          <w:rtl w:val="0"/>
+        </w:rPr>
+      </w:r>
+    </w:p>
+    <w:p>
+      <w:pPr>
+        <w:spacing w:after="160" w:line="278.00000000000006" w:lineRule="auto"/>
+        <w:rPr>
+          <w:rFonts w:ascii="Times New Roman" w:cs="Times New Roman" w:eastAsia="Times New Roman" w:hAnsi="Times New Roman"/>
+          <w:sz w:val="26"/>
+          <w:szCs w:val="26"/>
+        </w:rPr>
+      </w:pPr>
+      <w:r>
+        <w:rPr>
+          <w:rFonts w:ascii="Times New Roman" w:cs="Times New Roman" w:eastAsia="Times New Roman" w:hAnsi="Times New Roman"/>
+          <w:sz w:val="26"/>
+          <w:szCs w:val="26"/>
+          <w:rtl w:val="0"/>
+        </w:rPr>
+        <w:t xml:space="preserve">The values of ESP and EBP registers after establishing the stack:</w:t>
+      </w:r>
+    </w:p>
+    <w:p>
+      <w:pPr>
+        <w:spacing w:after="160" w:line="278.00000000000006" w:lineRule="auto"/>
+        <w:rPr>
+          <w:rFonts w:ascii="Times New Roman" w:cs="Times New Roman" w:eastAsia="Times New Roman" w:hAnsi="Times New Roman"/>
+          <w:sz w:val="26"/>
+          <w:szCs w:val="26"/>
+        </w:rPr>
+      </w:pPr>
+      <w:r>
+        <w:rPr>
+          <w:rFonts w:ascii="Times New Roman" w:cs="Times New Roman" w:eastAsia="Times New Roman" w:hAnsi="Times New Roman"/>
+          <w:sz w:val="26"/>
+          <w:szCs w:val="26"/>
+        </w:rPr>
+        <w:drawing>
+          <wp:inline distB="0" distT="0" distL="0" distR="0">
+            <wp:extent cx="5700713" cy="1631423"/>
+            <wp:effectExtent b="0" l="0" r="0" t="0"/>
+            <wp:docPr id="19" name="image11.png"/>
+            <a:graphic>
+              <a:graphicData uri="http://schemas.openxmlformats.org/drawingml/2006/picture">
+                <pic:pic>
+                  <pic:nvPicPr>
+                    <pic:cNvPr id="0" name="image11.png"/>
+                    <pic:cNvPicPr preferRelativeResize="0"/>
+                  </pic:nvPicPr>
+                  <pic:blipFill>
+                    <a:blip r:embed="rId21"/>
+                    <a:srcRect b="0" l="0" r="0" t="0"/>
+                    <a:stretch>
+                      <a:fillRect/>
+                    </a:stretch>
+                  </pic:blipFill>
+                  <pic:spPr>
+                    <a:xfrm>
+                      <a:off x="0" y="0"/>
+                      <a:ext cx="5700713" cy="1631423"/>
+                    </a:xfrm>
+                    <a:prstGeom prst="rect"/>
+                    <a:ln/>
+                  </pic:spPr>
+                </pic:pic>
+              </a:graphicData>
+            </a:graphic>
+          </wp:inline>
+        </w:drawing>
+      </w:r>
+      <w:r>
+        <w:rPr>
+          <w:rFonts w:ascii="Times New Roman" w:cs="Times New Roman" w:eastAsia="Times New Roman" w:hAnsi="Times New Roman"/>
+          <w:sz w:val="26"/>
+          <w:szCs w:val="26"/>
+        </w:rPr>
+        <w:drawing>
+          <wp:inline distB="0" distT="0" distL="0" distR="0">
+            <wp:extent cx="5691188" cy="481990"/>
+            <wp:effectExtent b="0" l="0" r="0" t="0"/>
+            <wp:docPr id="20" name="image4.png"/>
+            <a:graphic>
+              <a:graphicData uri="http://schemas.openxmlformats.org/drawingml/2006/picture">
+                <pic:pic>
+                  <pic:nvPicPr>
+                    <pic:cNvPr id="0" name="image4.png"/>
+                    <pic:cNvPicPr preferRelativeResize="0"/>
+                  </pic:nvPicPr>
+                  <pic:blipFill>
+                    <a:blip r:embed="rId22"/>
+                    <a:srcRect b="0" l="0" r="0" t="0"/>
+                    <a:stretch>
+                      <a:fillRect/>
+                    </a:stretch>
+                  </pic:blipFill>
+                  <pic:spPr>
+                    <a:xfrm>
+                      <a:off x="0" y="0"/>
+                      <a:ext cx="5691188" cy="481990"/>
+                    </a:xfrm>
+                    <a:prstGeom prst="rect"/>
+                    <a:ln/>
+                  </pic:spPr>
+                </pic:pic>
+              </a:graphicData>
+            </a:graphic>
+          </wp:inline>
+        </w:drawing>
+      </w:r>
+      <w:r>
+        <w:rPr>
+          <w:rtl w:val="0"/>
+        </w:rPr>
+      </w:r>
+    </w:p>
+    <w:p>
+      <w:pPr>
+        <w:spacing w:after="160" w:line="278.00000000000006" w:lineRule="auto"/>
+        <w:rPr>
+          <w:rFonts w:ascii="Times New Roman" w:cs="Times New Roman" w:eastAsia="Times New Roman" w:hAnsi="Times New Roman"/>
+          <w:sz w:val="26"/>
+          <w:szCs w:val="26"/>
+        </w:rPr>
+      </w:pPr>
+      <w:r>
+        <w:rPr>
+          <w:rFonts w:ascii="Times New Roman" w:cs="Times New Roman" w:eastAsia="Times New Roman" w:hAnsi="Times New Roman"/>
+          <w:sz w:val="26"/>
+          <w:szCs w:val="26"/>
+          <w:rtl w:val="0"/>
+        </w:rPr>
+        <w:t xml:space="preserve">The values of ESP and EBP registers just after returning the function:</w:t>
+      </w:r>
+    </w:p>
+    <w:p>
+      <w:pPr>
+        <w:spacing w:after="160" w:line="278.00000000000006" w:lineRule="auto"/>
+        <w:rPr>
+          <w:rFonts w:ascii="Times New Roman" w:cs="Times New Roman" w:eastAsia="Times New Roman" w:hAnsi="Times New Roman"/>
+          <w:sz w:val="26"/>
+          <w:szCs w:val="26"/>
+        </w:rPr>
+      </w:pPr>
+      <w:r>
+        <w:rPr>
+          <w:rFonts w:ascii="Times New Roman" w:cs="Times New Roman" w:eastAsia="Times New Roman" w:hAnsi="Times New Roman"/>
+          <w:sz w:val="26"/>
+          <w:szCs w:val="26"/>
+        </w:rPr>
+        <w:drawing>
+          <wp:inline distB="0" distT="0" distL="0" distR="0">
+            <wp:extent cx="5681663" cy="1587523"/>
+            <wp:effectExtent b="0" l="0" r="0" t="0"/>
+            <wp:docPr id="21" name="image22.png"/>
+            <a:graphic>
+              <a:graphicData uri="http://schemas.openxmlformats.org/drawingml/2006/picture">
+                <pic:pic>
+                  <pic:nvPicPr>
+                    <pic:cNvPr id="0" name="image22.png"/>
+                    <pic:cNvPicPr preferRelativeResize="0"/>
+                  </pic:nvPicPr>
+                  <pic:blipFill>
+                    <a:blip r:embed="rId23"/>
+                    <a:srcRect b="0" l="0" r="0" t="0"/>
+                    <a:stretch>
+                      <a:fillRect/>
+                    </a:stretch>
+                  </pic:blipFill>
+                  <pic:spPr>
+                    <a:xfrm>
+                      <a:off x="0" y="0"/>
+                      <a:ext cx="5681663" cy="1587523"/>
+                    </a:xfrm>
+                    <a:prstGeom prst="rect"/>
+                    <a:ln/>
+                  </pic:spPr>
+                </pic:pic>
+              </a:graphicData>
+            </a:graphic>
+          </wp:inline>
+        </w:drawing>
+      </w:r>
+      <w:r>
+        <w:rPr>
+          <w:rtl w:val="0"/>
+        </w:rPr>
+      </w:r>
+    </w:p>
+    <w:p>
+      <w:pPr>
+        <w:spacing w:after="160" w:line="278.00000000000006" w:lineRule="auto"/>
+        <w:rPr>
+          <w:rFonts w:ascii="Times New Roman" w:cs="Times New Roman" w:eastAsia="Times New Roman" w:hAnsi="Times New Roman"/>
+          <w:sz w:val="26"/>
+          <w:szCs w:val="26"/>
+        </w:rPr>
+      </w:pPr>
+      <w:r>
+        <w:rPr>
+          <w:rFonts w:ascii="Times New Roman" w:cs="Times New Roman" w:eastAsia="Times New Roman" w:hAnsi="Times New Roman"/>
+          <w:sz w:val="26"/>
+          <w:szCs w:val="26"/>
+        </w:rPr>
+        <w:drawing>
+          <wp:inline distB="0" distT="0" distL="0" distR="0">
+            <wp:extent cx="5662613" cy="417050"/>
+            <wp:effectExtent b="0" l="0" r="0" t="0"/>
+            <wp:docPr id="22" name="image17.png"/>
+            <a:graphic>
+              <a:graphicData uri="http://schemas.openxmlformats.org/drawingml/2006/picture">
+                <pic:pic>
+                  <pic:nvPicPr>
+                    <pic:cNvPr id="0" name="image17.png"/>
+                    <pic:cNvPicPr preferRelativeResize="0"/>
+                  </pic:nvPicPr>
+                  <pic:blipFill>
+                    <a:blip r:embed="rId24"/>
+                    <a:srcRect b="0" l="0" r="0" t="0"/>
+                    <a:stretch>
+                      <a:fillRect/>
+                    </a:stretch>
+                  </pic:blipFill>
+                  <pic:spPr>
+                    <a:xfrm>
+                      <a:off x="0" y="0"/>
+                      <a:ext cx="5662613" cy="417050"/>
+                    </a:xfrm>
+                    <a:prstGeom prst="rect"/>
+                    <a:ln/>
+                  </pic:spPr>
+                </pic:pic>
+              </a:graphicData>
+            </a:graphic>
+          </wp:inline>
+        </w:drawing>
+      </w:r>
       <w:r>
         <w:rPr>
           <w:rtl w:val="0"/>
@@ -2294,16 +2150,16 @@
           <wp:inline distB="114300" distT="114300" distL="114300" distR="114300">
             <wp:extent cx="4572000" cy="1000741"/>
             <wp:effectExtent b="0" l="0" r="0" t="0"/>
-            <wp:docPr id="3" name="image15.png"/>
+            <wp:docPr id="23" name="image21.png"/>
             <a:graphic>
               <a:graphicData uri="http://schemas.openxmlformats.org/drawingml/2006/picture">
                 <pic:pic>
                   <pic:nvPicPr>
-                    <pic:cNvPr id="0" name="image15.png"/>
+                    <pic:cNvPr id="0" name="image21.png"/>
                     <pic:cNvPicPr preferRelativeResize="0"/>
                   </pic:nvPicPr>
                   <pic:blipFill>
-                    <a:blip r:embed="rId17"/>
+                    <a:blip r:embed="rId25"/>
                     <a:srcRect b="0" l="0" r="0" t="4487"/>
                     <a:stretch>
                       <a:fillRect/>
@@ -2357,16 +2213,16 @@
           <wp:inline distB="114300" distT="114300" distL="114300" distR="114300">
             <wp:extent cx="4533900" cy="733425"/>
             <wp:effectExtent b="0" l="0" r="0" t="0"/>
-            <wp:docPr id="5" name="image6.png"/>
+            <wp:docPr id="1" name="image7.png"/>
             <a:graphic>
               <a:graphicData uri="http://schemas.openxmlformats.org/drawingml/2006/picture">
                 <pic:pic>
                   <pic:nvPicPr>
-                    <pic:cNvPr id="0" name="image6.png"/>
+                    <pic:cNvPr id="0" name="image7.png"/>
                     <pic:cNvPicPr preferRelativeResize="0"/>
                   </pic:nvPicPr>
                   <pic:blipFill>
-                    <a:blip r:embed="rId18"/>
+                    <a:blip r:embed="rId26"/>
                     <a:srcRect b="0" l="0" r="0" t="0"/>
                     <a:stretch>
                       <a:fillRect/>
@@ -2407,7 +2263,7 @@
           <w:szCs w:val="26"/>
           <w:rtl w:val="0"/>
         </w:rPr>
-        <w:t xml:space="preserve">This is the workflow* before and after calling the function: </w:t>
+        <w:t xml:space="preserve">This is the workflow* before and after calling a function: </w:t>
       </w:r>
     </w:p>
     <w:p>
@@ -2465,16 +2321,16 @@
           <wp:inline distB="114300" distT="114300" distL="114300" distR="114300">
             <wp:extent cx="4600575" cy="1695450"/>
             <wp:effectExtent b="0" l="0" r="0" t="0"/>
-            <wp:docPr id="1" name="image3.png"/>
+            <wp:docPr id="2" name="image5.png"/>
             <a:graphic>
               <a:graphicData uri="http://schemas.openxmlformats.org/drawingml/2006/picture">
                 <pic:pic>
                   <pic:nvPicPr>
-                    <pic:cNvPr id="0" name="image3.png"/>
+                    <pic:cNvPr id="0" name="image5.png"/>
                     <pic:cNvPicPr preferRelativeResize="0"/>
                   </pic:nvPicPr>
                   <pic:blipFill>
-                    <a:blip r:embed="rId19"/>
+                    <a:blip r:embed="rId27"/>
                     <a:srcRect b="0" l="0" r="0" t="0"/>
                     <a:stretch>
                       <a:fillRect/>
@@ -2529,41 +2385,61 @@
           <w:szCs w:val="26"/>
           <w:rtl w:val="0"/>
         </w:rPr>
-        <w:t xml:space="preserve">To access the parameters, we can either increment ESP or get the value of [EBP + n*4], where n  is the position on the stack relative to EBP of the parameters. So, parameter a is: </w:t>
-      </w:r>
-    </w:p>
-    <w:p>
-      <w:pPr>
-        <w:rPr>
-          <w:rFonts w:ascii="Times New Roman" w:cs="Times New Roman" w:eastAsia="Times New Roman" w:hAnsi="Times New Roman"/>
-          <w:sz w:val="26"/>
-          <w:szCs w:val="26"/>
-        </w:rPr>
-      </w:pPr>
-      <w:r>
-        <w:rPr>
-          <w:rtl w:val="0"/>
-        </w:rPr>
-      </w:r>
-    </w:p>
-    <w:p>
-      <w:pPr>
-        <w:jc w:val="center"/>
+        <w:t xml:space="preserve">To access the parameters, we can either increment ESP or get the value of [EBP + n*4], where n  is the position on the stack relative to EBP of the parameters. So, parameter</w:t>
+      </w:r>
+      <w:r>
         <w:rPr>
           <w:rFonts w:ascii="Times New Roman" w:cs="Times New Roman" w:eastAsia="Times New Roman" w:hAnsi="Times New Roman"/>
           <w:b w:val="1"/>
           <w:bCs w:val="1"/>
           <w:sz w:val="26"/>
           <w:szCs w:val="26"/>
-        </w:rPr>
-      </w:pPr>
-      <w:r>
+          <w:rtl w:val="0"/>
+        </w:rPr>
+        <w:t xml:space="preserve"> a</w:t>
+      </w:r>
+      <w:r>
+        <w:rPr>
+          <w:rFonts w:ascii="Times New Roman" w:cs="Times New Roman" w:eastAsia="Times New Roman" w:hAnsi="Times New Roman"/>
+          <w:sz w:val="26"/>
+          <w:szCs w:val="26"/>
+          <w:rtl w:val="0"/>
+        </w:rPr>
+        <w:t xml:space="preserve"> is: </w:t>
+      </w:r>
+    </w:p>
+    <w:p>
+      <w:pPr>
+        <w:rPr>
+          <w:rFonts w:ascii="Times New Roman" w:cs="Times New Roman" w:eastAsia="Times New Roman" w:hAnsi="Times New Roman"/>
+          <w:sz w:val="26"/>
+          <w:szCs w:val="26"/>
+        </w:rPr>
+      </w:pPr>
+      <w:r>
+        <w:rPr>
+          <w:rtl w:val="0"/>
+        </w:rPr>
+      </w:r>
+    </w:p>
+    <w:p>
+      <w:pPr>
+        <w:jc w:val="center"/>
         <w:rPr>
           <w:rFonts w:ascii="Times New Roman" w:cs="Times New Roman" w:eastAsia="Times New Roman" w:hAnsi="Times New Roman"/>
           <w:b w:val="1"/>
           <w:bCs w:val="1"/>
           <w:sz w:val="26"/>
           <w:szCs w:val="26"/>
+        </w:rPr>
+      </w:pPr>
+      <w:r>
+        <w:rPr>
+          <w:rFonts w:ascii="Times New Roman" w:cs="Times New Roman" w:eastAsia="Times New Roman" w:hAnsi="Times New Roman"/>
+          <w:b w:val="1"/>
+          <w:bCs w:val="1"/>
+          <w:sz w:val="26"/>
+          <w:szCs w:val="26"/>
           <w:rtl w:val="0"/>
         </w:rPr>
         <w:t xml:space="preserve">[EBP + 2*4] = [EBP + 8] </w:t>
@@ -2599,7 +2475,7 @@
           <w:szCs w:val="26"/>
           <w:rtl w:val="0"/>
         </w:rPr>
-        <w:t xml:space="preserve">EBP is used this way, because typically* it served the purpose of a stable reference point, whilst ESP is more dynamic and is moved from push, pop, inc etc. </w:t>
+        <w:t xml:space="preserve">EBP is used this way, because typically* It served the purpose of a stable reference point, whilst ESP is more dynamic and is moved from push, pop, inc etc. </w:t>
       </w:r>
     </w:p>
     <w:p>
@@ -2642,7 +2518,7 @@
           <w:szCs w:val="26"/>
         </w:rPr>
       </w:pPr>
-      <w:hyperlink r:id="rId20">
+      <w:hyperlink r:id="rId28">
         <w:r>
           <w:rPr>
             <w:rFonts w:ascii="Times New Roman" w:cs="Times New Roman" w:eastAsia="Times New Roman" w:hAnsi="Times New Roman"/>
@@ -2669,7 +2545,7 @@
           <w:szCs w:val="26"/>
         </w:rPr>
       </w:pPr>
-      <w:hyperlink r:id="rId21">
+      <w:hyperlink r:id="rId29">
         <w:r>
           <w:rPr>
             <w:rFonts w:ascii="Times New Roman" w:cs="Times New Roman" w:eastAsia="Times New Roman" w:hAnsi="Times New Roman"/>
@@ -2767,16 +2643,16 @@
           <wp:inline distB="114300" distT="114300" distL="114300" distR="114300">
             <wp:extent cx="3967163" cy="2566061"/>
             <wp:effectExtent b="0" l="0" r="0" t="0"/>
-            <wp:docPr id="4" name="image11.jpg"/>
+            <wp:docPr id="3" name="image18.jpg"/>
             <a:graphic>
               <a:graphicData uri="http://schemas.openxmlformats.org/drawingml/2006/picture">
                 <pic:pic>
                   <pic:nvPicPr>
-                    <pic:cNvPr id="0" name="image11.jpg"/>
+                    <pic:cNvPr id="0" name="image18.jpg"/>
                     <pic:cNvPicPr preferRelativeResize="0"/>
                   </pic:nvPicPr>
                   <pic:blipFill>
-                    <a:blip r:embed="rId22"/>
+                    <a:blip r:embed="rId30"/>
                     <a:srcRect b="1954" l="2961" r="14145" t="0"/>
                     <a:stretch>
                       <a:fillRect/>
@@ -3179,7 +3055,7 @@
         </w:rPr>
         <w:t xml:space="preserve">Sources: </w:t>
       </w:r>
-      <w:hyperlink r:id="rId23">
+      <w:hyperlink r:id="rId31">
         <w:r>
           <w:rPr>
             <w:rFonts w:ascii="Times New Roman" w:cs="Times New Roman" w:eastAsia="Times New Roman" w:hAnsi="Times New Roman"/>
@@ -3311,7 +3187,6 @@
           <w:rFonts w:ascii="Times New Roman" w:cs="Times New Roman" w:eastAsia="Times New Roman" w:hAnsi="Times New Roman"/>
           <w:sz w:val="26"/>
           <w:szCs w:val="26"/>
-          <w:u w:val="none"/>
         </w:rPr>
       </w:pPr>
       <w:r>
@@ -3322,6 +3197,11 @@
           <w:rtl w:val="0"/>
         </w:rPr>
         <w:t xml:space="preserve">Part 1: AsmZeroBit()</w:t>
+      </w:r>
+      <w:r>
+        <w:rPr>
+          <w:rtl w:val="0"/>
+        </w:rPr>
       </w:r>
     </w:p>
     <w:p>
@@ -3335,7 +3215,6 @@
           <w:rFonts w:ascii="Times New Roman" w:cs="Times New Roman" w:eastAsia="Times New Roman" w:hAnsi="Times New Roman"/>
           <w:sz w:val="26"/>
           <w:szCs w:val="26"/>
-          <w:u w:val="none"/>
         </w:rPr>
       </w:pPr>
       <w:r>
@@ -3346,6 +3225,11 @@
           <w:rtl w:val="0"/>
         </w:rPr>
         <w:t xml:space="preserve">Part 2: Exercise 2</w:t>
+      </w:r>
+      <w:r>
+        <w:rPr>
+          <w:rtl w:val="0"/>
+        </w:rPr>
       </w:r>
     </w:p>
     <w:p>
@@ -3359,7 +3243,6 @@
           <w:rFonts w:ascii="Times New Roman" w:cs="Times New Roman" w:eastAsia="Times New Roman" w:hAnsi="Times New Roman"/>
           <w:sz w:val="26"/>
           <w:szCs w:val="26"/>
-          <w:u w:val="none"/>
         </w:rPr>
       </w:pPr>
       <w:r>
@@ -3370,6 +3253,11 @@
           <w:rtl w:val="0"/>
         </w:rPr>
         <w:t xml:space="preserve">Time: ~143 min</w:t>
+      </w:r>
+      <w:r>
+        <w:rPr>
+          <w:rtl w:val="0"/>
+        </w:rPr>
       </w:r>
     </w:p>
     <w:p>
@@ -3462,7 +3350,6 @@
           <w:rFonts w:ascii="Times New Roman" w:cs="Times New Roman" w:eastAsia="Times New Roman" w:hAnsi="Times New Roman"/>
           <w:sz w:val="26"/>
           <w:szCs w:val="26"/>
-          <w:u w:val="none"/>
         </w:rPr>
       </w:pPr>
       <w:r>
@@ -3473,6 +3360,11 @@
           <w:rtl w:val="0"/>
         </w:rPr>
         <w:t xml:space="preserve">Teamwork report</w:t>
+      </w:r>
+      <w:r>
+        <w:rPr>
+          <w:rtl w:val="0"/>
+        </w:rPr>
       </w:r>
     </w:p>
     <w:p>
@@ -3597,7 +3489,7 @@
           <w:szCs w:val="26"/>
           <w:rtl w:val="0"/>
         </w:rPr>
-        <w:t xml:space="preserve">Time: ~59 min</w:t>
+        <w:t xml:space="preserve">Time: ~70 min</w:t>
       </w:r>
     </w:p>
     <w:p>
@@ -3703,8 +3595,8 @@
       </w:r>
     </w:p>
     <w:sectPr>
-      <w:headerReference r:id="rId24" w:type="default"/>
-      <w:headerReference r:id="rId25" w:type="first"/>
+      <w:headerReference r:id="rId32" w:type="default"/>
+      <w:headerReference r:id="rId33" w:type="first"/>
       <w:pgSz w:h="15840" w:w="12240" w:orient="portrait"/>
       <w:pgMar w:bottom="1152" w:top="1152" w:left="1440" w:right="1440" w:header="720" w:footer="720"/>
       <w:pgNumType w:start="0"/>
@@ -3718,8 +3610,16 @@
 <w:hdr xmlns:mc="http://schemas.openxmlformats.org/markup-compatibility/2006" xmlns:o="urn:schemas-microsoft-com:office:office" xmlns:r="http://schemas.openxmlformats.org/officeDocument/2006/relationships" xmlns:m="http://schemas.openxmlformats.org/officeDocument/2006/math" xmlns:v="urn:schemas-microsoft-com:vml" xmlns:wp="http://schemas.openxmlformats.org/drawingml/2006/wordprocessingDrawing" xmlns:w10="urn:schemas-microsoft-com:office:word" xmlns:w="http://schemas.openxmlformats.org/wordprocessingml/2006/main" xmlns:wne="http://schemas.microsoft.com/office/word/2006/wordml" xmlns:sl="http://schemas.openxmlformats.org/schemaLibrary/2006/main" xmlns:a="http://schemas.openxmlformats.org/drawingml/2006/main" xmlns:pic="http://schemas.openxmlformats.org/drawingml/2006/picture" xmlns:c="http://schemas.openxmlformats.org/drawingml/2006/chart" xmlns:lc="http://schemas.openxmlformats.org/drawingml/2006/lockedCanvas" xmlns:dgm="http://schemas.openxmlformats.org/drawingml/2006/diagram" xmlns:wps="http://schemas.microsoft.com/office/word/2010/wordprocessingShape" xmlns:wpg="http://schemas.microsoft.com/office/word/2010/wordprocessingGroup" xmlns:w14="http://schemas.microsoft.com/office/word/2010/wordml" xmlns:w15="http://schemas.microsoft.com/office/word/2012/wordml" xmlns:w16="http://schemas.microsoft.com/office/word/2018/wordml" xmlns:w16cex="http://schemas.microsoft.com/office/word/2018/wordml/cex" xmlns:w16cid="http://schemas.microsoft.com/office/word/2016/wordml/cid" xmlns="http://schemas.microsoft.com/office/tasks/2019/documenttasks" xmlns:cr="http://schemas.microsoft.com/office/comments/2020/reactions">
   <w:p>
     <w:pPr>
+      <w:jc w:val="right"/>
       <w:rPr/>
     </w:pPr>
+    <w:r>
+      <w:rPr/>
+      <w:fldChar w:fldCharType="begin"/>
+      <w:instrText xml:space="preserve">PAGE</w:instrText>
+      <w:fldChar w:fldCharType="separate"/>
+      <w:fldChar w:fldCharType="end"/>
+    </w:r>
     <w:r>
       <w:rPr>
         <w:rtl w:val="0"/>
@@ -3733,16 +3633,8 @@
 <w:hdr xmlns:mc="http://schemas.openxmlformats.org/markup-compatibility/2006" xmlns:o="urn:schemas-microsoft-com:office:office" xmlns:r="http://schemas.openxmlformats.org/officeDocument/2006/relationships" xmlns:m="http://schemas.openxmlformats.org/officeDocument/2006/math" xmlns:v="urn:schemas-microsoft-com:vml" xmlns:wp="http://schemas.openxmlformats.org/drawingml/2006/wordprocessingDrawing" xmlns:w10="urn:schemas-microsoft-com:office:word" xmlns:w="http://schemas.openxmlformats.org/wordprocessingml/2006/main" xmlns:wne="http://schemas.microsoft.com/office/word/2006/wordml" xmlns:sl="http://schemas.openxmlformats.org/schemaLibrary/2006/main" xmlns:a="http://schemas.openxmlformats.org/drawingml/2006/main" xmlns:pic="http://schemas.openxmlformats.org/drawingml/2006/picture" xmlns:c="http://schemas.openxmlformats.org/drawingml/2006/chart" xmlns:lc="http://schemas.openxmlformats.org/drawingml/2006/lockedCanvas" xmlns:dgm="http://schemas.openxmlformats.org/drawingml/2006/diagram" xmlns:wps="http://schemas.microsoft.com/office/word/2010/wordprocessingShape" xmlns:wpg="http://schemas.microsoft.com/office/word/2010/wordprocessingGroup" xmlns:w14="http://schemas.microsoft.com/office/word/2010/wordml" xmlns:w15="http://schemas.microsoft.com/office/word/2012/wordml" xmlns:w16="http://schemas.microsoft.com/office/word/2018/wordml" xmlns:w16cex="http://schemas.microsoft.com/office/word/2018/wordml/cex" xmlns:w16cid="http://schemas.microsoft.com/office/word/2016/wordml/cid" xmlns="http://schemas.microsoft.com/office/tasks/2019/documenttasks" xmlns:cr="http://schemas.microsoft.com/office/comments/2020/reactions">
   <w:p>
     <w:pPr>
-      <w:jc w:val="right"/>
       <w:rPr/>
     </w:pPr>
-    <w:r>
-      <w:rPr/>
-      <w:fldChar w:fldCharType="begin"/>
-      <w:instrText xml:space="preserve">PAGE</w:instrText>
-      <w:fldChar w:fldCharType="separate"/>
-      <w:fldChar w:fldCharType="end"/>
-    </w:r>
     <w:r>
       <w:rPr>
         <w:rtl w:val="0"/>

</xml_diff>